<commit_message>
Writing kit: final AI-judge results on two-judge panel for all 7 systems
Mistral Large became unavailable (403), so every system is compared on
Nemotron 3 Ultra + gpt-oss-120b. Adds final-system judge significance
table, two- vs three-judge check, updated WASSA validity, and revised
text in 3.4, 3.6, 3.7, 3.8, 4.1, 5.1, 5.2, 5.3, 5.6 and tools.

Co-Authored-By: Claude Opus 5 (1M context) <noreply@anthropic.com>
</commit_message>
<xml_diff>
--- a/writing/Chapter 3 - 3.6 Project Management Plan/FINAL_TEXT.docx
+++ b/writing/Chapter 3 - 3.6 Project Management Plan/FINAL_TEXT.docx
@@ -1100,7 +1100,7 @@
               <w:rPr>
                 <w:sz w:val="16"/>
               </w:rPr>
-              <w:t>Google Form (13 items); AI-judge scores for final system</w:t>
+              <w:t>Google Form (13 items); AI-judge scores for final system (completed, two-judge panel)</w:t>
             </w:r>
           </w:p>
         </w:tc>
@@ -1419,7 +1419,7 @@
         <w:t>Replacement of the judge panel (August 2026).</w:t>
       </w:r>
       <w:r>
-        <w:t xml:space="preserve"> Several planned judges became unavailable because of quota limits and model retirements. The panel was rebuilt from three other providers, and judging was divided between two accounts to work within a daily limit of 50 requests.</w:t>
+        <w:t xml:space="preserve"> Several planned judges became unavailable because of quota limits and model retirements. The panel was rebuilt from other providers, and judging was divided between two accounts to work within a daily limit of 50 requests. In September 2026, Mistral Large also became unavailable on both team accounts, so the final comparison was completed on the two judges that had scored every system, after checking that removing the third judge did not change the ranking of the systems it had scored.</w:t>
       </w:r>
     </w:p>
     <w:p>
@@ -1568,11 +1568,9 @@
             <w:r/>
             <w:r>
               <w:rPr>
-                <w:b/>
-                <w:color w:val="B03A00"/>
                 <w:sz w:val="16"/>
               </w:rPr>
-              <w:t>[[TEAM TO FILL]]</w:t>
+              <w:t>September 2026</w:t>
             </w:r>
           </w:p>
         </w:tc>
@@ -1586,7 +1584,7 @@
               <w:rPr>
                 <w:sz w:val="16"/>
               </w:rPr>
-              <w:t>In progress</w:t>
+              <w:t>Completed</w:t>
             </w:r>
           </w:p>
         </w:tc>

</xml_diff>